<commit_message>
README: add NLTK download step and per-method run commands
- Step 3: one-time NLTK download (punkt, punkt_tab, stopwords); the
  scripts' silent runtime download fails offline or without write access
- New "Running Individual Method Scripts" section covering the baseline
  and Methods 1-6
- Rebuild Readme.docx from the updated README

Co-Authored-By: Claude Opus 5.5 <noreply@anthropic.com>
</commit_message>
<xml_diff>
--- a/Readme.docx
+++ b/Readme.docx
@@ -70,7 +70,7 @@
         </w:rPr>
         <w:t xml:space="preserve">For the full technical write-up (dataset, every method's settings, per-class results, known issues), see </w:t>
       </w:r>
-      <w:hyperlink w:history="1" r:id="rIdwica0pmdmv4lwgcvht6ej">
+      <w:hyperlink w:history="1" r:id="rIdecgse89u51yyj24wzz2pm">
         <w:r>
           <w:rPr>
             <w:rStyle w:val="Hyperlink"/>
@@ -1076,16 +1076,8 @@
       </w:r>
     </w:p>
     <w:p>
-      <w:pPr>
-        <w:pStyle w:val="Heading2"/>
-      </w:pPr>
-      <w:r>
-        <w:t xml:space="preserve">Step 4 — Set the project path</w:t>
-      </w:r>
-    </w:p>
-    <w:p>
-      <w:r>
-        <w:t xml:space="preserve">Every script, </w:t>
+      <w:r>
+        <w:t xml:space="preserve">Then download the NLTK data used by the Cedars-Sinai baseline, </w:t>
       </w:r>
       <w:r>
         <w:rPr>
@@ -1094,34 +1086,10 @@
           <w:szCs w:val="19"/>
           <w:shd w:fill="F2F4F7" w:color="auto" w:val="clear"/>
         </w:rPr>
-        <w:t xml:space="preserve">demo/explainer.py</w:t>
-      </w:r>
-      <w:r>
-        <w:t xml:space="preserve"> and </w:t>
-      </w:r>
-      <w:r>
-        <w:rPr>
-          <w:rFonts w:ascii="Consolas" w:cs="Consolas" w:eastAsia="Consolas" w:hAnsi="Consolas"/>
-          <w:sz w:val="19"/>
-          <w:szCs w:val="19"/>
-          <w:shd w:fill="F2F4F7" w:color="auto" w:val="clear"/>
-        </w:rPr>
-        <w:t xml:space="preserve">demo/save_models.py</w:t>
-      </w:r>
-      <w:r>
-        <w:t xml:space="preserve"> sets </w:t>
-      </w:r>
-      <w:r>
-        <w:rPr>
-          <w:rFonts w:ascii="Consolas" w:cs="Consolas" w:eastAsia="Consolas" w:hAnsi="Consolas"/>
-          <w:sz w:val="19"/>
-          <w:szCs w:val="19"/>
-          <w:shd w:fill="F2F4F7" w:color="auto" w:val="clear"/>
-        </w:rPr>
-        <w:t xml:space="preserve">BASE_DIR</w:t>
-      </w:r>
-      <w:r>
-        <w:t xml:space="preserve"> near the top to the original author's Windows path. Change it to the folder where you cloned the repo:</w:t>
+        <w:t xml:space="preserve">save_models.py</w:t>
+      </w:r>
+      <w:r>
+        <w:t xml:space="preserve"> and the demo UI (one time only):</w:t>
       </w:r>
     </w:p>
     <w:p>
@@ -1136,59 +1104,7 @@
           <w:sz w:val="18"/>
           <w:szCs w:val="18"/>
         </w:rPr>
-        <w:t xml:space="preserve">BASE_DIR = r"C:\path\to\MEDREx-Masters-Project"</w:t>
-      </w:r>
-    </w:p>
-    <w:p>
-      <w:pPr>
-        <w:pStyle w:val="Heading2"/>
-      </w:pPr>
-      <w:r>
-        <w:t xml:space="preserve">Step 5 — Set up API key (Method 6 only)</w:t>
-      </w:r>
-    </w:p>
-    <w:p>
-      <w:r>
-        <w:t xml:space="preserve">Create a file named </w:t>
-      </w:r>
-      <w:r>
-        <w:rPr>
-          <w:rFonts w:ascii="Consolas" w:cs="Consolas" w:eastAsia="Consolas" w:hAnsi="Consolas"/>
-          <w:sz w:val="19"/>
-          <w:szCs w:val="19"/>
-          <w:shd w:fill="F2F4F7" w:color="auto" w:val="clear"/>
-        </w:rPr>
-        <w:t xml:space="preserve">.env</w:t>
-      </w:r>
-      <w:r>
-        <w:t xml:space="preserve"> inside the </w:t>
-      </w:r>
-      <w:r>
-        <w:rPr>
-          <w:rFonts w:ascii="Consolas" w:cs="Consolas" w:eastAsia="Consolas" w:hAnsi="Consolas"/>
-          <w:sz w:val="19"/>
-          <w:szCs w:val="19"/>
-          <w:shd w:fill="F2F4F7" w:color="auto" w:val="clear"/>
-        </w:rPr>
-        <w:t xml:space="preserve">demo/ProjectCode/</w:t>
-      </w:r>
-      <w:r>
-        <w:t xml:space="preserve"> folder:</w:t>
-      </w:r>
-    </w:p>
-    <w:p>
-      <w:pPr>
-        <w:shd w:fill="F2F4F7" w:color="auto" w:val="clear"/>
-        <w:spacing w:after="160" w:before="80" w:line="260"/>
-        <w:ind w:left="120" w:right="120"/>
-      </w:pPr>
-      <w:r>
-        <w:rPr>
-          <w:rFonts w:ascii="Consolas" w:cs="Consolas" w:eastAsia="Consolas" w:hAnsi="Consolas"/>
-          <w:sz w:val="18"/>
-          <w:szCs w:val="18"/>
-        </w:rPr>
-        <w:t xml:space="preserve">OPENAI_API_KEY=your_openai_api_key_here</w:t>
+        <w:t xml:space="preserve">python -c "import nltk; nltk.download('punkt'); nltk.download('punkt_tab'); nltk.download('stopwords')"</w:t>
       </w:r>
     </w:p>
     <w:p>
@@ -1204,7 +1120,7 @@
           <w:i/>
           <w:iCs/>
         </w:rPr>
-        <w:t xml:space="preserve">If you do not have an OpenAI key, the other five methods still run normally. Only Method 6 needs the key.</w:t>
+        <w:t xml:space="preserve">The scripts also try to download this data silently when they start. That download fails without internet access or write permission to the NLTK data folder, and tokenization then errors out. Running the command above once avoids this.</w:t>
       </w:r>
     </w:p>
     <w:p>
@@ -1212,39 +1128,12 @@
         <w:pStyle w:val="Heading2"/>
       </w:pPr>
       <w:r>
-        <w:t xml:space="preserve">Step 6 — Launch the demo</w:t>
-      </w:r>
-    </w:p>
-    <w:p>
-      <w:pPr>
-        <w:shd w:fill="F2F4F7" w:color="auto" w:val="clear"/>
-        <w:spacing w:after="160" w:before="80" w:line="260"/>
-        <w:ind w:left="120" w:right="120"/>
-      </w:pPr>
-      <w:r>
-        <w:rPr>
-          <w:rFonts w:ascii="Consolas" w:cs="Consolas" w:eastAsia="Consolas" w:hAnsi="Consolas"/>
-          <w:sz w:val="18"/>
-          <w:szCs w:val="18"/>
-        </w:rPr>
-        <w:t xml:space="preserve">streamlit run demo/explainer.py</w:t>
-      </w:r>
-    </w:p>
-    <w:p>
-      <w:r>
-        <w:t xml:space="preserve">Open your browser and go to: </w:t>
-      </w:r>
-      <w:r>
-        <w:rPr>
-          <w:b/>
-          <w:bCs/>
-        </w:rPr>
-        <w:t xml:space="preserve">http://localhost:8501</w:t>
-      </w:r>
-    </w:p>
-    <w:p>
-      <w:r>
-        <w:t xml:space="preserve">The Cedars-Sinai, Method 1 and Method 2 tabs use the models already saved in </w:t>
+        <w:t xml:space="preserve">Step 4 — Set the project path</w:t>
+      </w:r>
+    </w:p>
+    <w:p>
+      <w:r>
+        <w:t xml:space="preserve">Every script, </w:t>
       </w:r>
       <w:r>
         <w:rPr>
@@ -1253,10 +1142,10 @@
           <w:szCs w:val="19"/>
           <w:shd w:fill="F2F4F7" w:color="auto" w:val="clear"/>
         </w:rPr>
-        <w:t xml:space="preserve">demo/saved_models/</w:t>
-      </w:r>
-      <w:r>
-        <w:t xml:space="preserve">. To rebuild those models, run </w:t>
+        <w:t xml:space="preserve">demo/explainer.py</w:t>
+      </w:r>
+      <w:r>
+        <w:t xml:space="preserve"> and </w:t>
       </w:r>
       <w:r>
         <w:rPr>
@@ -1265,10 +1154,525 @@
           <w:szCs w:val="19"/>
           <w:shd w:fill="F2F4F7" w:color="auto" w:val="clear"/>
         </w:rPr>
+        <w:t xml:space="preserve">demo/save_models.py</w:t>
+      </w:r>
+      <w:r>
+        <w:t xml:space="preserve"> sets </w:t>
+      </w:r>
+      <w:r>
+        <w:rPr>
+          <w:rFonts w:ascii="Consolas" w:cs="Consolas" w:eastAsia="Consolas" w:hAnsi="Consolas"/>
+          <w:sz w:val="19"/>
+          <w:szCs w:val="19"/>
+          <w:shd w:fill="F2F4F7" w:color="auto" w:val="clear"/>
+        </w:rPr>
+        <w:t xml:space="preserve">BASE_DIR</w:t>
+      </w:r>
+      <w:r>
+        <w:t xml:space="preserve"> near the top to the original author's Windows path. Change it to the folder where you cloned the repo:</w:t>
+      </w:r>
+    </w:p>
+    <w:p>
+      <w:pPr>
+        <w:shd w:fill="F2F4F7" w:color="auto" w:val="clear"/>
+        <w:spacing w:after="160" w:before="80" w:line="260"/>
+        <w:ind w:left="120" w:right="120"/>
+      </w:pPr>
+      <w:r>
+        <w:rPr>
+          <w:rFonts w:ascii="Consolas" w:cs="Consolas" w:eastAsia="Consolas" w:hAnsi="Consolas"/>
+          <w:sz w:val="18"/>
+          <w:szCs w:val="18"/>
+        </w:rPr>
+        <w:t xml:space="preserve">BASE_DIR = r"C:\path\to\MEDREx-Masters-Project"</w:t>
+      </w:r>
+    </w:p>
+    <w:p>
+      <w:pPr>
+        <w:pStyle w:val="Heading2"/>
+      </w:pPr>
+      <w:r>
+        <w:t xml:space="preserve">Step 5 — Set up API key (Method 6 only)</w:t>
+      </w:r>
+    </w:p>
+    <w:p>
+      <w:r>
+        <w:t xml:space="preserve">Create a file named </w:t>
+      </w:r>
+      <w:r>
+        <w:rPr>
+          <w:rFonts w:ascii="Consolas" w:cs="Consolas" w:eastAsia="Consolas" w:hAnsi="Consolas"/>
+          <w:sz w:val="19"/>
+          <w:szCs w:val="19"/>
+          <w:shd w:fill="F2F4F7" w:color="auto" w:val="clear"/>
+        </w:rPr>
+        <w:t xml:space="preserve">.env</w:t>
+      </w:r>
+      <w:r>
+        <w:t xml:space="preserve"> inside the </w:t>
+      </w:r>
+      <w:r>
+        <w:rPr>
+          <w:rFonts w:ascii="Consolas" w:cs="Consolas" w:eastAsia="Consolas" w:hAnsi="Consolas"/>
+          <w:sz w:val="19"/>
+          <w:szCs w:val="19"/>
+          <w:shd w:fill="F2F4F7" w:color="auto" w:val="clear"/>
+        </w:rPr>
+        <w:t xml:space="preserve">demo/ProjectCode/</w:t>
+      </w:r>
+      <w:r>
+        <w:t xml:space="preserve"> folder:</w:t>
+      </w:r>
+    </w:p>
+    <w:p>
+      <w:pPr>
+        <w:shd w:fill="F2F4F7" w:color="auto" w:val="clear"/>
+        <w:spacing w:after="160" w:before="80" w:line="260"/>
+        <w:ind w:left="120" w:right="120"/>
+      </w:pPr>
+      <w:r>
+        <w:rPr>
+          <w:rFonts w:ascii="Consolas" w:cs="Consolas" w:eastAsia="Consolas" w:hAnsi="Consolas"/>
+          <w:sz w:val="18"/>
+          <w:szCs w:val="18"/>
+        </w:rPr>
+        <w:t xml:space="preserve">OPENAI_API_KEY=your_openai_api_key_here</w:t>
+      </w:r>
+    </w:p>
+    <w:p>
+      <w:pPr>
+        <w:pBdr>
+          <w:left w:val="single" w:color="1F4E79" w:sz="18" w:space="8"/>
+        </w:pBdr>
+        <w:shd w:fill="EEF3F8" w:color="auto" w:val="clear"/>
+        <w:ind w:left="360"/>
+      </w:pPr>
+      <w:r>
+        <w:rPr>
+          <w:i/>
+          <w:iCs/>
+        </w:rPr>
+        <w:t xml:space="preserve">If you do not have an OpenAI key, the other five methods still run normally. Only Method 6 needs the key.</w:t>
+      </w:r>
+    </w:p>
+    <w:p>
+      <w:pPr>
+        <w:pStyle w:val="Heading2"/>
+      </w:pPr>
+      <w:r>
+        <w:t xml:space="preserve">Step 6 — Launch the demo</w:t>
+      </w:r>
+    </w:p>
+    <w:p>
+      <w:pPr>
+        <w:shd w:fill="F2F4F7" w:color="auto" w:val="clear"/>
+        <w:spacing w:after="160" w:before="80" w:line="260"/>
+        <w:ind w:left="120" w:right="120"/>
+      </w:pPr>
+      <w:r>
+        <w:rPr>
+          <w:rFonts w:ascii="Consolas" w:cs="Consolas" w:eastAsia="Consolas" w:hAnsi="Consolas"/>
+          <w:sz w:val="18"/>
+          <w:szCs w:val="18"/>
+        </w:rPr>
+        <w:t xml:space="preserve">streamlit run demo/explainer.py</w:t>
+      </w:r>
+    </w:p>
+    <w:p>
+      <w:r>
+        <w:t xml:space="preserve">Open your browser and go to: </w:t>
+      </w:r>
+      <w:r>
+        <w:rPr>
+          <w:b/>
+          <w:bCs/>
+        </w:rPr>
+        <w:t xml:space="preserve">http://localhost:8501</w:t>
+      </w:r>
+    </w:p>
+    <w:p>
+      <w:r>
+        <w:t xml:space="preserve">The Cedars-Sinai, Method 1 and Method 2 tabs use the models already saved in </w:t>
+      </w:r>
+      <w:r>
+        <w:rPr>
+          <w:rFonts w:ascii="Consolas" w:cs="Consolas" w:eastAsia="Consolas" w:hAnsi="Consolas"/>
+          <w:sz w:val="19"/>
+          <w:szCs w:val="19"/>
+          <w:shd w:fill="F2F4F7" w:color="auto" w:val="clear"/>
+        </w:rPr>
+        <w:t xml:space="preserve">demo/saved_models/</w:t>
+      </w:r>
+      <w:r>
+        <w:t xml:space="preserve">. To rebuild those models, run </w:t>
+      </w:r>
+      <w:r>
+        <w:rPr>
+          <w:rFonts w:ascii="Consolas" w:cs="Consolas" w:eastAsia="Consolas" w:hAnsi="Consolas"/>
+          <w:sz w:val="19"/>
+          <w:szCs w:val="19"/>
+          <w:shd w:fill="F2F4F7" w:color="auto" w:val="clear"/>
+        </w:rPr>
         <w:t xml:space="preserve">python demo/save_models.py</w:t>
       </w:r>
       <w:r>
         <w:t xml:space="preserve">; this needs the dataset.</w:t>
+      </w:r>
+    </w:p>
+    <w:p>
+      <w:pPr>
+        <w:pBdr>
+          <w:bottom w:val="single" w:color="BFBFBF" w:sz="6" w:space="1"/>
+        </w:pBdr>
+        <w:spacing w:after="120"/>
+      </w:pPr>
+    </w:p>
+    <w:p>
+      <w:pPr>
+        <w:pStyle w:val="Heading1"/>
+      </w:pPr>
+      <w:r>
+        <w:t xml:space="preserve">Running Individual Method Scripts</w:t>
+      </w:r>
+    </w:p>
+    <w:p>
+      <w:r>
+        <w:t xml:space="preserve">Each method can also be run as a standalone script from the repo root. Every script prints a step-by-step log and saves it to </w:t>
+      </w:r>
+      <w:r>
+        <w:rPr>
+          <w:rFonts w:ascii="Consolas" w:cs="Consolas" w:eastAsia="Consolas" w:hAnsi="Consolas"/>
+          <w:sz w:val="19"/>
+          <w:szCs w:val="19"/>
+          <w:shd w:fill="F2F4F7" w:color="auto" w:val="clear"/>
+        </w:rPr>
+        <w:t xml:space="preserve">demo/ProjectCode/output/</w:t>
+      </w:r>
+      <w:r>
+        <w:t xml:space="preserve">. All of them need the dataset in </w:t>
+      </w:r>
+      <w:r>
+        <w:rPr>
+          <w:rFonts w:ascii="Consolas" w:cs="Consolas" w:eastAsia="Consolas" w:hAnsi="Consolas"/>
+          <w:sz w:val="19"/>
+          <w:szCs w:val="19"/>
+          <w:shd w:fill="F2F4F7" w:color="auto" w:val="clear"/>
+        </w:rPr>
+        <w:t xml:space="preserve">DataSet/</w:t>
+      </w:r>
+      <w:r>
+        <w:t xml:space="preserve"> (see </w:t>
+      </w:r>
+      <w:hyperlink w:history="1" w:anchor="dataset-note" r:id="rIdifeb5pxfhwtwo7arnudgz">
+        <w:r>
+          <w:rPr>
+            <w:rStyle w:val="Hyperlink"/>
+          </w:rPr>
+          <w:t xml:space="preserve">Dataset Note</w:t>
+        </w:r>
+      </w:hyperlink>
+      <w:r>
+        <w:t xml:space="preserve">).</w:t>
+      </w:r>
+    </w:p>
+    <w:p>
+      <w:pPr>
+        <w:shd w:fill="F2F4F7" w:color="auto" w:val="clear"/>
+        <w:spacing w:after="0" w:before="80" w:line="260"/>
+        <w:ind w:left="120" w:right="120"/>
+      </w:pPr>
+      <w:r>
+        <w:rPr>
+          <w:rFonts w:ascii="Consolas" w:cs="Consolas" w:eastAsia="Consolas" w:hAnsi="Consolas"/>
+          <w:sz w:val="18"/>
+          <w:szCs w:val="18"/>
+        </w:rPr>
+        <w:t xml:space="preserve"># Cedars-Sinai baseline — BoW + Logistic Regression and Random Forest (~10–25 min)</w:t>
+      </w:r>
+    </w:p>
+    <w:p>
+      <w:pPr>
+        <w:shd w:fill="F2F4F7" w:color="auto" w:val="clear"/>
+        <w:spacing w:after="0" w:before="0" w:line="260"/>
+        <w:ind w:left="120" w:right="120"/>
+      </w:pPr>
+      <w:r>
+        <w:rPr>
+          <w:rFonts w:ascii="Consolas" w:cs="Consolas" w:eastAsia="Consolas" w:hAnsi="Consolas"/>
+          <w:sz w:val="18"/>
+          <w:szCs w:val="18"/>
+        </w:rPr>
+        <w:t xml:space="preserve">python demo/CedarCinaiCode/cedars_sinai_pipeline.py</w:t>
+      </w:r>
+    </w:p>
+    <w:p>
+      <w:pPr>
+        <w:shd w:fill="F2F4F7" w:color="auto" w:val="clear"/>
+        <w:spacing w:after="0" w:before="0" w:line="260"/>
+        <w:ind w:left="120" w:right="120"/>
+      </w:pPr>
+      <w:r>
+        <w:rPr>
+          <w:rFonts w:ascii="Consolas" w:cs="Consolas" w:eastAsia="Consolas" w:hAnsi="Consolas"/>
+          <w:sz w:val="18"/>
+          <w:szCs w:val="18"/>
+        </w:rPr>
+        <w:t xml:space="preserve"> </w:t>
+      </w:r>
+    </w:p>
+    <w:p>
+      <w:pPr>
+        <w:shd w:fill="F2F4F7" w:color="auto" w:val="clear"/>
+        <w:spacing w:after="0" w:before="0" w:line="260"/>
+        <w:ind w:left="120" w:right="120"/>
+      </w:pPr>
+      <w:r>
+        <w:rPr>
+          <w:rFonts w:ascii="Consolas" w:cs="Consolas" w:eastAsia="Consolas" w:hAnsi="Consolas"/>
+          <w:sz w:val="18"/>
+          <w:szCs w:val="18"/>
+        </w:rPr>
+        <w:t xml:space="preserve"># Method 1 — TF-IDF + Logistic Regression</w:t>
+      </w:r>
+    </w:p>
+    <w:p>
+      <w:pPr>
+        <w:shd w:fill="F2F4F7" w:color="auto" w:val="clear"/>
+        <w:spacing w:after="0" w:before="0" w:line="260"/>
+        <w:ind w:left="120" w:right="120"/>
+      </w:pPr>
+      <w:r>
+        <w:rPr>
+          <w:rFonts w:ascii="Consolas" w:cs="Consolas" w:eastAsia="Consolas" w:hAnsi="Consolas"/>
+          <w:sz w:val="18"/>
+          <w:szCs w:val="18"/>
+        </w:rPr>
+        <w:t xml:space="preserve">python demo/ProjectCode/method1_tfidf_logistic_regression.py</w:t>
+      </w:r>
+    </w:p>
+    <w:p>
+      <w:pPr>
+        <w:shd w:fill="F2F4F7" w:color="auto" w:val="clear"/>
+        <w:spacing w:after="0" w:before="0" w:line="260"/>
+        <w:ind w:left="120" w:right="120"/>
+      </w:pPr>
+      <w:r>
+        <w:rPr>
+          <w:rFonts w:ascii="Consolas" w:cs="Consolas" w:eastAsia="Consolas" w:hAnsi="Consolas"/>
+          <w:sz w:val="18"/>
+          <w:szCs w:val="18"/>
+        </w:rPr>
+        <w:t xml:space="preserve"> </w:t>
+      </w:r>
+    </w:p>
+    <w:p>
+      <w:pPr>
+        <w:shd w:fill="F2F4F7" w:color="auto" w:val="clear"/>
+        <w:spacing w:after="0" w:before="0" w:line="260"/>
+        <w:ind w:left="120" w:right="120"/>
+      </w:pPr>
+      <w:r>
+        <w:rPr>
+          <w:rFonts w:ascii="Consolas" w:cs="Consolas" w:eastAsia="Consolas" w:hAnsi="Consolas"/>
+          <w:sz w:val="18"/>
+          <w:szCs w:val="18"/>
+        </w:rPr>
+        <w:t xml:space="preserve"># Method 2 — TF-IDF + SVM</w:t>
+      </w:r>
+    </w:p>
+    <w:p>
+      <w:pPr>
+        <w:shd w:fill="F2F4F7" w:color="auto" w:val="clear"/>
+        <w:spacing w:after="0" w:before="0" w:line="260"/>
+        <w:ind w:left="120" w:right="120"/>
+      </w:pPr>
+      <w:r>
+        <w:rPr>
+          <w:rFonts w:ascii="Consolas" w:cs="Consolas" w:eastAsia="Consolas" w:hAnsi="Consolas"/>
+          <w:sz w:val="18"/>
+          <w:szCs w:val="18"/>
+        </w:rPr>
+        <w:t xml:space="preserve">python demo/ProjectCode/method2_tfidf_svm.py</w:t>
+      </w:r>
+    </w:p>
+    <w:p>
+      <w:pPr>
+        <w:shd w:fill="F2F4F7" w:color="auto" w:val="clear"/>
+        <w:spacing w:after="0" w:before="0" w:line="260"/>
+        <w:ind w:left="120" w:right="120"/>
+      </w:pPr>
+      <w:r>
+        <w:rPr>
+          <w:rFonts w:ascii="Consolas" w:cs="Consolas" w:eastAsia="Consolas" w:hAnsi="Consolas"/>
+          <w:sz w:val="18"/>
+          <w:szCs w:val="18"/>
+        </w:rPr>
+        <w:t xml:space="preserve"> </w:t>
+      </w:r>
+    </w:p>
+    <w:p>
+      <w:pPr>
+        <w:shd w:fill="F2F4F7" w:color="auto" w:val="clear"/>
+        <w:spacing w:after="0" w:before="0" w:line="260"/>
+        <w:ind w:left="120" w:right="120"/>
+      </w:pPr>
+      <w:r>
+        <w:rPr>
+          <w:rFonts w:ascii="Consolas" w:cs="Consolas" w:eastAsia="Consolas" w:hAnsi="Consolas"/>
+          <w:sz w:val="18"/>
+          <w:szCs w:val="18"/>
+        </w:rPr>
+        <w:t xml:space="preserve"># Method 3 — BERT (evaluates the downloaded model in demo/ProjectCode/method3_best_model/)</w:t>
+      </w:r>
+    </w:p>
+    <w:p>
+      <w:pPr>
+        <w:shd w:fill="F2F4F7" w:color="auto" w:val="clear"/>
+        <w:spacing w:after="0" w:before="0" w:line="260"/>
+        <w:ind w:left="120" w:right="120"/>
+      </w:pPr>
+      <w:r>
+        <w:rPr>
+          <w:rFonts w:ascii="Consolas" w:cs="Consolas" w:eastAsia="Consolas" w:hAnsi="Consolas"/>
+          <w:sz w:val="18"/>
+          <w:szCs w:val="18"/>
+        </w:rPr>
+        <w:t xml:space="preserve">python demo/ProjectCode/method3_evaluate_local.py</w:t>
+      </w:r>
+    </w:p>
+    <w:p>
+      <w:pPr>
+        <w:shd w:fill="F2F4F7" w:color="auto" w:val="clear"/>
+        <w:spacing w:after="0" w:before="0" w:line="260"/>
+        <w:ind w:left="120" w:right="120"/>
+      </w:pPr>
+      <w:r>
+        <w:rPr>
+          <w:rFonts w:ascii="Consolas" w:cs="Consolas" w:eastAsia="Consolas" w:hAnsi="Consolas"/>
+          <w:sz w:val="18"/>
+          <w:szCs w:val="18"/>
+        </w:rPr>
+        <w:t xml:space="preserve"> </w:t>
+      </w:r>
+    </w:p>
+    <w:p>
+      <w:pPr>
+        <w:shd w:fill="F2F4F7" w:color="auto" w:val="clear"/>
+        <w:spacing w:after="0" w:before="0" w:line="260"/>
+        <w:ind w:left="120" w:right="120"/>
+      </w:pPr>
+      <w:r>
+        <w:rPr>
+          <w:rFonts w:ascii="Consolas" w:cs="Consolas" w:eastAsia="Consolas" w:hAnsi="Consolas"/>
+          <w:sz w:val="18"/>
+          <w:szCs w:val="18"/>
+        </w:rPr>
+        <w:t xml:space="preserve"># Method 4 — Embedding similarity k-NN (also builds the embedding cache for Methods 5 and 6)</w:t>
+      </w:r>
+    </w:p>
+    <w:p>
+      <w:pPr>
+        <w:shd w:fill="F2F4F7" w:color="auto" w:val="clear"/>
+        <w:spacing w:after="0" w:before="0" w:line="260"/>
+        <w:ind w:left="120" w:right="120"/>
+      </w:pPr>
+      <w:r>
+        <w:rPr>
+          <w:rFonts w:ascii="Consolas" w:cs="Consolas" w:eastAsia="Consolas" w:hAnsi="Consolas"/>
+          <w:sz w:val="18"/>
+          <w:szCs w:val="18"/>
+        </w:rPr>
+        <w:t xml:space="preserve">python demo/ProjectCode/method4_embedding_knn.py</w:t>
+      </w:r>
+    </w:p>
+    <w:p>
+      <w:pPr>
+        <w:shd w:fill="F2F4F7" w:color="auto" w:val="clear"/>
+        <w:spacing w:after="0" w:before="0" w:line="260"/>
+        <w:ind w:left="120" w:right="120"/>
+      </w:pPr>
+      <w:r>
+        <w:rPr>
+          <w:rFonts w:ascii="Consolas" w:cs="Consolas" w:eastAsia="Consolas" w:hAnsi="Consolas"/>
+          <w:sz w:val="18"/>
+          <w:szCs w:val="18"/>
+        </w:rPr>
+        <w:t xml:space="preserve"> </w:t>
+      </w:r>
+    </w:p>
+    <w:p>
+      <w:pPr>
+        <w:shd w:fill="F2F4F7" w:color="auto" w:val="clear"/>
+        <w:spacing w:after="0" w:before="0" w:line="260"/>
+        <w:ind w:left="120" w:right="120"/>
+      </w:pPr>
+      <w:r>
+        <w:rPr>
+          <w:rFonts w:ascii="Consolas" w:cs="Consolas" w:eastAsia="Consolas" w:hAnsi="Consolas"/>
+          <w:sz w:val="18"/>
+          <w:szCs w:val="18"/>
+        </w:rPr>
+        <w:t xml:space="preserve"># Method 5 — RAG + Ollama (needs Ollama: https://ollama.com, then `ollama pull llama3.2`)</w:t>
+      </w:r>
+    </w:p>
+    <w:p>
+      <w:pPr>
+        <w:shd w:fill="F2F4F7" w:color="auto" w:val="clear"/>
+        <w:spacing w:after="0" w:before="0" w:line="260"/>
+        <w:ind w:left="120" w:right="120"/>
+      </w:pPr>
+      <w:r>
+        <w:rPr>
+          <w:rFonts w:ascii="Consolas" w:cs="Consolas" w:eastAsia="Consolas" w:hAnsi="Consolas"/>
+          <w:sz w:val="18"/>
+          <w:szCs w:val="18"/>
+        </w:rPr>
+        <w:t xml:space="preserve">python demo/ProjectCode/method5_rag_llm.py</w:t>
+      </w:r>
+    </w:p>
+    <w:p>
+      <w:pPr>
+        <w:shd w:fill="F2F4F7" w:color="auto" w:val="clear"/>
+        <w:spacing w:after="0" w:before="0" w:line="260"/>
+        <w:ind w:left="120" w:right="120"/>
+      </w:pPr>
+      <w:r>
+        <w:rPr>
+          <w:rFonts w:ascii="Consolas" w:cs="Consolas" w:eastAsia="Consolas" w:hAnsi="Consolas"/>
+          <w:sz w:val="18"/>
+          <w:szCs w:val="18"/>
+        </w:rPr>
+        <w:t xml:space="preserve"> </w:t>
+      </w:r>
+    </w:p>
+    <w:p>
+      <w:pPr>
+        <w:shd w:fill="F2F4F7" w:color="auto" w:val="clear"/>
+        <w:spacing w:after="0" w:before="0" w:line="260"/>
+        <w:ind w:left="120" w:right="120"/>
+      </w:pPr>
+      <w:r>
+        <w:rPr>
+          <w:rFonts w:ascii="Consolas" w:cs="Consolas" w:eastAsia="Consolas" w:hAnsi="Consolas"/>
+          <w:sz w:val="18"/>
+          <w:szCs w:val="18"/>
+        </w:rPr>
+        <w:t xml:space="preserve"># Method 6 — RAG + OpenAI (needs OPENAI_API_KEY in demo/ProjectCode/.env)</w:t>
+      </w:r>
+    </w:p>
+    <w:p>
+      <w:pPr>
+        <w:shd w:fill="F2F4F7" w:color="auto" w:val="clear"/>
+        <w:spacing w:after="160" w:before="0" w:line="260"/>
+        <w:ind w:left="120" w:right="120"/>
+      </w:pPr>
+      <w:r>
+        <w:rPr>
+          <w:rFonts w:ascii="Consolas" w:cs="Consolas" w:eastAsia="Consolas" w:hAnsi="Consolas"/>
+          <w:sz w:val="18"/>
+          <w:szCs w:val="18"/>
+        </w:rPr>
+        <w:t xml:space="preserve">python demo/ProjectCode/method6_rag_openai.py</w:t>
       </w:r>
     </w:p>
     <w:p>

</xml_diff>